<commit_message>
reorg papers and adding acl 2026
</commit_message>
<xml_diff>
--- a/papers/body_coming_off/abstract.docx
+++ b/papers/body_coming_off/abstract.docx
@@ -12,21 +12,101 @@
         <w:rPr>
           <w:rFonts w:ascii="Times New Roman" w:hAnsi="Times New Roman" w:cs="Times New Roman"/>
         </w:rPr>
-        <w:t xml:space="preserve">This paper examines the embodiment of cisgender subjects in the reality television series Love Is Blind through the lens of Trans Studies, focusing on how the denial and restoration of visual access to the other destabilize bodily coherence and romantic desire. Drawing on Jay Prosser’s concept of the “transsexual trajectory,” I argue that participants in Love Is Blind—while firmly anchored in </w:t>
-      </w:r>
-      <w:proofErr w:type="spellStart"/>
-      <w:r>
-        <w:rPr>
-          <w:rFonts w:ascii="Times New Roman" w:hAnsi="Times New Roman" w:cs="Times New Roman"/>
-        </w:rPr>
-        <w:t>cisnormative</w:t>
-      </w:r>
-      <w:proofErr w:type="spellEnd"/>
-      <w:r>
-        <w:rPr>
-          <w:rFonts w:ascii="Times New Roman" w:hAnsi="Times New Roman" w:cs="Times New Roman"/>
-        </w:rPr>
-        <w:t xml:space="preserve"> frameworks—temporarily experience a form of bodily dissonance. When love develops from behind a wall, participants’ relationships with their own bodies fracture: touch becomes spectral, overdetermined, and feared. To analyze this fracturing and its normalization, I train small-scale language models on transcripts from the show, using them as predictive instruments to surface shared linguistic and affective patterns around the body and touch. By mobilizing machine learning as a critical, non-extractive method, this project reframes prediction as a tool for studying normativity—demonstrating how cis participants’ attachments to bodily integrity echo trans theoretical concerns with materiality, coherence, and desire.</w:t>
+        <w:t xml:space="preserve">This paper examines the embodiment of cisgender subjects in the reality television series </w:t>
+      </w:r>
+      <w:r>
+        <w:rPr>
+          <w:rFonts w:ascii="Times New Roman" w:hAnsi="Times New Roman" w:cs="Times New Roman"/>
+          <w:i/>
+          <w:iCs/>
+        </w:rPr>
+        <w:t>Love Is Blind</w:t>
+      </w:r>
+      <w:r>
+        <w:rPr>
+          <w:rFonts w:ascii="Times New Roman" w:hAnsi="Times New Roman" w:cs="Times New Roman"/>
+        </w:rPr>
+        <w:t xml:space="preserve"> (2020-present)</w:t>
+      </w:r>
+      <w:r>
+        <w:rPr>
+          <w:rFonts w:ascii="Times New Roman" w:hAnsi="Times New Roman" w:cs="Times New Roman"/>
+        </w:rPr>
+        <w:t xml:space="preserve"> through the lens of Trans Studies</w:t>
+      </w:r>
+      <w:r>
+        <w:rPr>
+          <w:rFonts w:ascii="Times New Roman" w:hAnsi="Times New Roman" w:cs="Times New Roman"/>
+        </w:rPr>
+        <w:t xml:space="preserve">. It </w:t>
+      </w:r>
+      <w:r>
+        <w:rPr>
+          <w:rFonts w:ascii="Times New Roman" w:hAnsi="Times New Roman" w:cs="Times New Roman"/>
+        </w:rPr>
+        <w:t>argue</w:t>
+      </w:r>
+      <w:r>
+        <w:rPr>
+          <w:rFonts w:ascii="Times New Roman" w:hAnsi="Times New Roman" w:cs="Times New Roman"/>
+        </w:rPr>
+        <w:t>s</w:t>
+      </w:r>
+      <w:r>
+        <w:rPr>
+          <w:rFonts w:ascii="Times New Roman" w:hAnsi="Times New Roman" w:cs="Times New Roman"/>
+        </w:rPr>
+        <w:t xml:space="preserve"> that participants in </w:t>
+      </w:r>
+      <w:r>
+        <w:rPr>
+          <w:rFonts w:ascii="Times New Roman" w:hAnsi="Times New Roman" w:cs="Times New Roman"/>
+          <w:i/>
+          <w:iCs/>
+        </w:rPr>
+        <w:t>Love Is Blind</w:t>
+      </w:r>
+      <w:r>
+        <w:rPr>
+          <w:rFonts w:ascii="Times New Roman" w:hAnsi="Times New Roman" w:cs="Times New Roman"/>
+        </w:rPr>
+        <w:t>—while firmly anchored in cisnormative frameworks—temporarily experience a form of bodily dissonance</w:t>
+      </w:r>
+      <w:r>
+        <w:rPr>
+          <w:rFonts w:ascii="Times New Roman" w:hAnsi="Times New Roman" w:cs="Times New Roman"/>
+        </w:rPr>
+        <w:t xml:space="preserve"> where physical </w:t>
+      </w:r>
+      <w:r>
+        <w:rPr>
+          <w:rFonts w:ascii="Times New Roman" w:hAnsi="Times New Roman" w:cs="Times New Roman"/>
+        </w:rPr>
+        <w:t xml:space="preserve">touch becomes spectral, overdetermined, and feared. To analyze this </w:t>
+      </w:r>
+      <w:r>
+        <w:rPr>
+          <w:rFonts w:ascii="Times New Roman" w:hAnsi="Times New Roman" w:cs="Times New Roman"/>
+        </w:rPr>
+        <w:t>sensory fracture</w:t>
+      </w:r>
+      <w:r>
+        <w:rPr>
+          <w:rFonts w:ascii="Times New Roman" w:hAnsi="Times New Roman" w:cs="Times New Roman"/>
+        </w:rPr>
+        <w:t xml:space="preserve">, I train small-scale language models </w:t>
+      </w:r>
+      <w:r>
+        <w:rPr>
+          <w:rFonts w:ascii="Times New Roman" w:hAnsi="Times New Roman" w:cs="Times New Roman"/>
+        </w:rPr>
+        <w:t xml:space="preserve">(SLMs) </w:t>
+      </w:r>
+      <w:r>
+        <w:rPr>
+          <w:rFonts w:ascii="Times New Roman" w:hAnsi="Times New Roman" w:cs="Times New Roman"/>
+        </w:rPr>
+        <w:t>on transcripts from the show, using them as predictive instruments to surface shared linguistic and affective patterns around the body and touch. By mobilizing machine learning as a critical, non-extractive method, this project reframes prediction as a tool for studying normativity—demonstrating how cis participants’ attachments to bodily integrity echo trans theoretical concerns with materiality, coherence, and desire.</w:t>
       </w:r>
     </w:p>
     <w:sectPr>

</xml_diff>